<commit_message>
docs: add AOI level column to dataset tables (DEC-33)
Requested by Mehmet on DEC-33: AOI granularity per dataset and
whether it can be grouped into code blocks. Peitek already defines
block AOIs; EMIP and McChesney token/line AOIs can be grouped.

Co-Authored-By: Claude Opus 5.5 <noreply@anthropic.com>
Claude-Session: https://claude.ai/code/session_016EpQfHcEfRuit2km2g2NJd
</commit_message>
<xml_diff>
--- a/docs/sude/DEC-33-related-work-datasets.docx
+++ b/docs/sude/DEC-33-related-work-datasets.docx
@@ -116,12 +116,13 @@
         <w:jc w:val="start"/>
       </w:tblPr>
       <w:tblGrid>
-        <w:gridCol w:w="1320"/>
-        <w:gridCol w:w="1320"/>
-        <w:gridCol w:w="1320"/>
-        <w:gridCol w:w="1320"/>
-        <w:gridCol w:w="1320"/>
-        <w:gridCol w:w="1320"/>
+        <w:gridCol w:w="1131"/>
+        <w:gridCol w:w="1131"/>
+        <w:gridCol w:w="1131"/>
+        <w:gridCol w:w="1131"/>
+        <w:gridCol w:w="1131"/>
+        <w:gridCol w:w="1131"/>
+        <w:gridCol w:w="1131"/>
       </w:tblGrid>
       <w:tr>
         <w:trPr>
@@ -223,6 +224,22 @@
             </w:r>
           </w:p>
         </w:tc>
+        <w:tc>
+          <w:tcPr/>
+          <w:p>
+            <w:pPr>
+              <w:pStyle w:val="Compact"/>
+              <w:jc w:val="left"/>
+            </w:pPr>
+            <w:r>
+              <w:rPr>
+                <w:b/>
+                <w:sz w:val="18"/>
+              </w:rPr>
+              <w:t xml:space="preserve">AOI level</w:t>
+            </w:r>
+          </w:p>
+        </w:tc>
       </w:tr>
       <w:tr>
         <w:tc>
@@ -315,6 +332,21 @@
             </w:r>
           </w:p>
         </w:tc>
+        <w:tc>
+          <w:tcPr/>
+          <w:p>
+            <w:pPr>
+              <w:pStyle w:val="Compact"/>
+              <w:jc w:val="left"/>
+            </w:pPr>
+            <w:r>
+              <w:rPr>
+                <w:sz w:val="18"/>
+              </w:rPr>
+              <w:t xml:space="preserve">Token, with line numbers [2]; can be grouped into blocks</w:t>
+            </w:r>
+          </w:p>
+        </w:tc>
       </w:tr>
       <w:tr>
         <w:tc>
@@ -407,6 +439,21 @@
             </w:r>
           </w:p>
         </w:tc>
+        <w:tc>
+          <w:tcPr/>
+          <w:p>
+            <w:pPr>
+              <w:pStyle w:val="Compact"/>
+              <w:jc w:val="left"/>
+            </w:pPr>
+            <w:r>
+              <w:rPr>
+                <w:sz w:val="18"/>
+              </w:rPr>
+              <w:t xml:space="preserve">Token and line; can be grouped into blocks</w:t>
+            </w:r>
+          </w:p>
+        </w:tc>
       </w:tr>
       <w:tr>
         <w:tc>
@@ -499,6 +546,21 @@
             </w:r>
           </w:p>
         </w:tc>
+        <w:tc>
+          <w:tcPr/>
+          <w:p>
+            <w:pPr>
+              <w:pStyle w:val="Compact"/>
+              <w:jc w:val="left"/>
+            </w:pPr>
+            <w:r>
+              <w:rPr>
+                <w:sz w:val="18"/>
+              </w:rPr>
+              <w:t xml:space="preserve">Line and block (blocks already defined)</w:t>
+            </w:r>
+          </w:p>
+        </w:tc>
       </w:tr>
       <w:tr>
         <w:tc>
@@ -591,6 +653,21 @@
             </w:r>
           </w:p>
         </w:tc>
+        <w:tc>
+          <w:tcPr/>
+          <w:p>
+            <w:pPr>
+              <w:pStyle w:val="Compact"/>
+              <w:jc w:val="left"/>
+            </w:pPr>
+            <w:r>
+              <w:rPr>
+                <w:sz w:val="18"/>
+              </w:rPr>
+              <w:t xml:space="preserve">Token [5]; data not checked</w:t>
+            </w:r>
+          </w:p>
+        </w:tc>
       </w:tr>
       <w:tr>
         <w:tc>
@@ -707,6 +784,21 @@
             </w:r>
           </w:p>
         </w:tc>
+        <w:tc>
+          <w:tcPr/>
+          <w:p>
+            <w:pPr>
+              <w:pStyle w:val="Compact"/>
+              <w:jc w:val="left"/>
+            </w:pPr>
+            <w:r>
+              <w:rPr>
+                <w:sz w:val="18"/>
+              </w:rPr>
+              <w:t xml:space="preserve">Line and code part; can be grouped into blocks</w:t>
+            </w:r>
+          </w:p>
+        </w:tc>
       </w:tr>
       <w:tr>
         <w:tc>
@@ -799,6 +891,21 @@
             </w:r>
           </w:p>
         </w:tc>
+        <w:tc>
+          <w:tcPr/>
+          <w:p>
+            <w:pPr>
+              <w:pStyle w:val="Compact"/>
+              <w:jc w:val="left"/>
+            </w:pPr>
+            <w:r>
+              <w:rPr>
+                <w:sz w:val="18"/>
+              </w:rPr>
+              <w:t xml:space="preserve">Line and column (iTrace)</w:t>
+            </w:r>
+          </w:p>
+        </w:tc>
       </w:tr>
       <w:tr>
         <w:tc>
@@ -891,6 +998,21 @@
             </w:r>
           </w:p>
         </w:tc>
+        <w:tc>
+          <w:tcPr/>
+          <w:p>
+            <w:pPr>
+              <w:pStyle w:val="Compact"/>
+              <w:jc w:val="left"/>
+            </w:pPr>
+            <w:r>
+              <w:rPr>
+                <w:sz w:val="18"/>
+              </w:rPr>
+              <w:t xml:space="preserve">n/r</w:t>
+            </w:r>
+          </w:p>
+        </w:tc>
       </w:tr>
       <w:tr>
         <w:tc>
@@ -983,6 +1105,21 @@
             </w:r>
           </w:p>
         </w:tc>
+        <w:tc>
+          <w:tcPr/>
+          <w:p>
+            <w:pPr>
+              <w:pStyle w:val="Compact"/>
+              <w:jc w:val="left"/>
+            </w:pPr>
+            <w:r>
+              <w:rPr>
+                <w:sz w:val="18"/>
+              </w:rPr>
+              <w:t xml:space="preserve">Token</w:t>
+            </w:r>
+          </w:p>
+        </w:tc>
       </w:tr>
       <w:tr>
         <w:tc>
@@ -1075,6 +1212,21 @@
             </w:r>
           </w:p>
         </w:tc>
+        <w:tc>
+          <w:tcPr/>
+          <w:p>
+            <w:pPr>
+              <w:pStyle w:val="Compact"/>
+              <w:jc w:val="left"/>
+            </w:pPr>
+            <w:r>
+              <w:rPr>
+                <w:sz w:val="18"/>
+              </w:rPr>
+              <w:t xml:space="preserve">Token</w:t>
+            </w:r>
+          </w:p>
+        </w:tc>
       </w:tr>
       <w:tr>
         <w:tc>
@@ -1149,6 +1301,21 @@
                 <w:sz w:val="18"/>
               </w:rPr>
               <w:t xml:space="preserve">Yes</w:t>
+            </w:r>
+          </w:p>
+        </w:tc>
+        <w:tc>
+          <w:tcPr/>
+          <w:p>
+            <w:pPr>
+              <w:pStyle w:val="Compact"/>
+              <w:jc w:val="left"/>
+            </w:pPr>
+            <w:r>
+              <w:rPr>
+                <w:sz w:val="18"/>
+              </w:rPr>
+              <w:t xml:space="preserve">n/a</w:t>
             </w:r>
           </w:p>
         </w:tc>
@@ -2160,7 +2327,7 @@
         <w:t xml:space="preserve"> </w:t>
       </w:r>
       <w:r>
-        <w:t xml:space="preserve">The same code is laid out differently in each dataset: in EMIP, short methods are written on one line. Line-level areas of interest (AOIs) do not match across datasets, but method or block AOIs do. This supports block-level AOIs, which also suit webcam gaze: Fang et al. found that webcam data captures patterns at the semantic level but struggles at the token level [8].</w:t>
+        <w:t xml:space="preserve">The same code is laid out differently in each dataset: in EMIP, short methods are written on one line. Line-level areas of interest (AOIs) do not match across datasets, but method or block AOIs do. Peitek et al. already define block AOIs, and the token and line AOIs of EMIP and McChesney &amp; Bond can be grouped into blocks. This supports block-level AOIs, which also suit webcam gaze: Fang et al. found that webcam data captures patterns at the semantic level but struggles at the token level [8].</w:t>
       </w:r>
     </w:p>
     <w:p>

</xml_diff>